<commit_message>
Regenerate report with reference verification fixes
Regenerated NiXZ-121_Report.docx from build_report.py v1.3 to embody
the [4] MBACK title restoration and [8] Stern-Kim page correction
already staged in the previous commit, plus the rewritten "Note on
source verification" paragraph.

Verified in the emitted file:
  [4] "A method for normalization of X-ray absorption spectra (MBACK),"
      -- (MBACK) parenthetical is back
  [8] Phys. Rev. B 23, 3781 (1981) -- page range trimmed to just 3781,
      matching doc/NiXZ-121_project.md §9

Document metrics unchanged in shape: 146 paragraphs, 5 tables,
9 OMML equations, 26 inline [n] citation markers (44 total including
the reference list itself), same fonts (Georgia + 標楷體 eastAsia).

Co-Authored-By: Claude Opus 4.7 (1M context) <noreply@anthropic.com>
</commit_message>
<xml_diff>
--- a/NiXZ-121_Report.docx
+++ b/NiXZ-121_Report.docx
@@ -42,7 +42,7 @@
         <w:rPr>
           <w:sz w:val="22"/>
         </w:rPr>
-        <w:t>2026-09-28</w:t>
+        <w:t>2026-09-29</w:t>
       </w:r>
     </w:p>
     <w:p/>
@@ -2974,7 +2974,7 @@
         <w:ind w:left="425" w:hanging="425"/>
       </w:pPr>
       <w:r>
-        <w:t xml:space="preserve">[4] T.-C. Weng, G. S. Waldo, and J. E. Penner-Hahn, "A method for normalization of X-ray absorption spectra," </w:t>
+        <w:t xml:space="preserve">[4] T.-C. Weng, G. S. Waldo, and J. E. Penner-Hahn, "A method for normalization of X-ray absorption spectra (MBACK)," </w:t>
       </w:r>
       <w:r>
         <w:rPr>
@@ -3091,7 +3091,7 @@
         <w:t>23</w:t>
       </w:r>
       <w:r>
-        <w:t>, 3781–3787 (1981). doi:10.1103/PhysRevB.23.3781.</w:t>
+        <w:t>, 3781 (1981). doi:10.1103/PhysRevB.23.3781.</w:t>
       </w:r>
     </w:p>
     <w:p>
@@ -3123,7 +3123,7 @@
     </w:p>
     <w:p>
       <w:r>
-        <w:t>Note on source verification. References [1], [3], and [5] were consulted in full during the design of the corresponding rules and can be cited authoritatively. References [4], [7], [8], and [9] were confirmed from bibliographic search but not read in full; their conclusions are cited by convention. Reference [6] (Gaur 2026) was consulted at abstract level; the specific recommendations we compare against in section 4.6 (edge-jump window [0.5, 2.0], derivative-peak FWHM window [0.5, 2.0] eV) should be verified against the full text before being adopted in a downstream publication. Reference [2] was consulted for the specific question of whether xraylarch's estimate_noise applies to XANES data (it does not).</w:t>
+        <w:t>Note on source verification. References [1], [3], and [5] were consulted in full during the design of the corresponding rules and can be cited authoritatively; reference [5] is additionally available as a PDF in the project's references/ folder. Reference [2] was consulted for a single specific question -- whether xraylarch's estimate_noise applies to XANES data (it does not) -- so only the relevant passage was read. References [4] and [9] are cited from bibliographic metadata gathered through xraylarch's and TXM-Wizard's own reference lists, but the original text has not been read for this project. Reference [7] (Leys et al. 2013) is cited from bibliographic search; the DOI and page range are widely reported but were not verified line-by-line against the printed article. Reference [8] (Stern and Kim 1981) is cited from bibliographic search; the volume and starting page 3781 are well-established but the full page range and DOI have not been verified against the print. Reference [6] (Gaur et al. 2026) was consulted at abstract level only; the specific numerical recommendations we compare against in section 4.6 -- edge-jump window [0.5, 2.0] and derivative-peak FWHM window [0.5, 2.0] eV -- should be verified against the full text before being propagated to a downstream publication. The DOI 10.1038/s41597-026-07966-x follows the Scientific Data year-encoding convention (026 = 2026) but the specific serial number component has not been independently confirmed.</w:t>
       </w:r>
     </w:p>
     <w:p>

</xml_diff>